<commit_message>
Propostas: modelo timbrado, dados da empresa e a pasta em .zip
- Modelo padrão refeito a partir de docs/MODELO DE DOCUMENTO PROPOSTA.docx,
  com o timbrado da Inside Solutions, tabela dos itens, valor por extenso,
  dados bancários, declarações e representante (gerar_modelo.py versionado)
- Empresa: CPF, RG e qualificação do representante; banco, agência e conta
- GET /api/propostas/<id>/pasta/: .zip com a proposta comercial, a
  habilitação da empresa e os arquivos da licitação; botão no modal
- docs/Tarefas/feat-proposta.md com as tarefas

Co-Authored-By: Claude Opus 5.5 <noreply@anthropic.com>
</commit_message>
<xml_diff>
--- a/backend/apps/propostas/modelo_padrao.docx
+++ b/backend/apps/propostas/modelo_padrao.docx
@@ -3,82 +3,222 @@
 <w:document xmlns:wpc="http://schemas.microsoft.com/office/word/2010/wordprocessingCanvas" xmlns:mo="http://schemas.microsoft.com/office/mac/office/2008/main" xmlns:mc="http://schemas.openxmlformats.org/markup-compatibility/2006" xmlns:mv="urn:schemas-microsoft-com:mac:vml" xmlns:o="urn:schemas-microsoft-com:office:office" xmlns:r="http://schemas.openxmlformats.org/officeDocument/2006/relationships" xmlns:m="http://schemas.openxmlformats.org/officeDocument/2006/math" xmlns:v="urn:schemas-microsoft-com:vml" xmlns:wp14="http://schemas.microsoft.com/office/word/2010/wordprocessingDrawing" xmlns:wp="http://schemas.openxmlformats.org/drawingml/2006/wordprocessingDrawing" xmlns:w10="urn:schemas-microsoft-com:office:word" xmlns:w="http://schemas.openxmlformats.org/wordprocessingml/2006/main" xmlns:w14="http://schemas.microsoft.com/office/word/2010/wordml" xmlns:wpg="http://schemas.microsoft.com/office/word/2010/wordprocessingGroup" xmlns:wpi="http://schemas.microsoft.com/office/word/2010/wordprocessingInk" xmlns:wne="http://schemas.microsoft.com/office/word/2006/wordml" xmlns:wps="http://schemas.microsoft.com/office/word/2010/wordprocessingShape" mc:Ignorable="w14 wp14">
   <w:body>
     <w:p>
-      <w:r>
-        <w:rPr>
-          <w:b/>
-          <w:sz w:val="26"/>
-        </w:rPr>
-        <w:t>{{ empresa.nome }}</w:t>
-      </w:r>
-    </w:p>
-    <w:p>
-      <w:r>
-        <w:t>CNPJ {{ empresa.cnpj }} · IE {{ empresa.inscricao_estadual }}</w:t>
-      </w:r>
-    </w:p>
-    <w:p>
-      <w:r>
-        <w:t>{{ empresa.endereco }}</w:t>
-      </w:r>
-    </w:p>
-    <w:p>
-      <w:r>
-        <w:t>{{ empresa.telefone }} · {{ empresa.email }}</w:t>
-      </w:r>
-    </w:p>
-    <w:p>
       <w:pPr>
-        <w:jc w:val="center"/>
+        <w:spacing w:after="40"/>
+        <w:jc w:val="left"/>
       </w:pPr>
       <w:r>
         <w:rPr>
           <w:b/>
-          <w:sz w:val="28"/>
+          <w:i w:val="0"/>
+          <w:color w:val="020E26"/>
+          <w:sz w:val="36"/>
         </w:rPr>
         <w:t>PROPOSTA COMERCIAL</w:t>
       </w:r>
     </w:p>
     <w:p>
+      <w:pPr>
+        <w:spacing w:after="240"/>
+        <w:jc w:val="left"/>
+      </w:pPr>
       <w:r>
-        <w:t>Ao(À) {{ orgao.nome }} — UASG {{ orgao.uasg }} — {{ orgao.cidade }}</w:t>
+        <w:rPr>
+          <w:b/>
+          <w:i w:val="0"/>
+          <w:color w:val="1E8BF0"/>
+          <w:sz w:val="22"/>
+        </w:rPr>
+        <w:t>{{ edital.modalidade|upper }} Nº {{ edital.numero }}</w:t>
       </w:r>
     </w:p>
     <w:p>
+      <w:pPr>
+        <w:spacing w:after="0"/>
+        <w:jc w:val="left"/>
+      </w:pPr>
       <w:r>
-        <w:t>{{ edital.modalidade }} nº {{ edital.numero }}</w:t>
+        <w:rPr>
+          <w:b w:val="0"/>
+          <w:i w:val="0"/>
+          <w:color w:val="5B677A"/>
+        </w:rPr>
+        <w:t>À</w:t>
       </w:r>
     </w:p>
     <w:p>
+      <w:pPr>
+        <w:spacing w:after="0"/>
+        <w:jc w:val="left"/>
+      </w:pPr>
       <w:r>
-        <w:t>Objeto: {{ edital.objeto }}</w:t>
+        <w:rPr>
+          <w:b/>
+          <w:i w:val="0"/>
+          <w:color w:val="1F2937"/>
+        </w:rPr>
+        <w:t>{{ orgao.nome }}</w:t>
+      </w:r>
+    </w:p>
+    <w:p>
+      <w:pPr>
+        <w:spacing w:after="200"/>
+        <w:jc w:val="left"/>
+      </w:pPr>
+      <w:r>
+        <w:rPr>
+          <w:b w:val="0"/>
+          <w:i w:val="0"/>
+          <w:color w:val="5B677A"/>
+        </w:rPr>
+        <w:t>UASG {{ orgao.uasg }}{% if orgao.cidade %} · {{ orgao.cidade }}{% endif %}</w:t>
+      </w:r>
+    </w:p>
+    <w:p>
+      <w:pPr>
+        <w:spacing w:after="160"/>
+        <w:jc w:val="both"/>
+      </w:pPr>
+      <w:r>
+        <w:rPr>
+          <w:b w:val="0"/>
+          <w:i w:val="0"/>
+          <w:color w:val="1F2937"/>
+        </w:rPr>
+        <w:t>Prezados Senhores,</w:t>
+      </w:r>
+    </w:p>
+    <w:p>
+      <w:pPr>
+        <w:keepNext/>
+        <w:spacing w:before="200" w:after="80"/>
+      </w:pPr>
+      <w:r>
+        <w:rPr>
+          <w:b/>
+          <w:i w:val="0"/>
+          <w:color w:val="1E8BF0"/>
+          <w:sz w:val="21"/>
+        </w:rPr>
+        <w:t xml:space="preserve">1.  </w:t>
+      </w:r>
+      <w:r>
+        <w:rPr>
+          <w:b/>
+          <w:i w:val="0"/>
+          <w:color w:val="020E26"/>
+          <w:sz w:val="21"/>
+        </w:rPr>
+        <w:t>APRESENTAÇÃO</w:t>
+      </w:r>
+    </w:p>
+    <w:p>
+      <w:pPr>
+        <w:spacing w:after="120"/>
+        <w:jc w:val="both"/>
+      </w:pPr>
+      <w:r>
+        <w:rPr>
+          <w:b w:val="0"/>
+          <w:i w:val="0"/>
+          <w:color w:val="1F2937"/>
+        </w:rPr>
+        <w:t>A empresa {{ empresa.nome }}, inscrita no CNPJ/MF sob o nº {{ empresa.cnpj }}, sediada na {{ empresa.endereco }}, por seu representante legal infra-assinado e qualificado, vem por meio desta apresentar sua proposta de preços para o {{ edital.modalidade }} nº {{ edital.numero }}, em conformidade com a sessão pública de lances ofertados por meio eletrônico{% if edital.prazo %} em {{ edital.prazo }}{% endif %}, DECLARANDO AINDA, sob as penas da Lei, ter pleno conhecimento do teor do respectivo edital, subordinando-se ao contido no mesmo, cujos dispositivos reconhece, para todos os efeitos, terem caráter contratual.</w:t>
+      </w:r>
+    </w:p>
+    <w:p>
+      <w:pPr>
+        <w:keepNext/>
+        <w:spacing w:before="200" w:after="80"/>
+      </w:pPr>
+      <w:r>
+        <w:rPr>
+          <w:b/>
+          <w:i w:val="0"/>
+          <w:color w:val="1E8BF0"/>
+          <w:sz w:val="21"/>
+        </w:rPr>
+        <w:t xml:space="preserve">2.  </w:t>
+      </w:r>
+      <w:r>
+        <w:rPr>
+          <w:b/>
+          <w:i w:val="0"/>
+          <w:color w:val="020E26"/>
+          <w:sz w:val="21"/>
+        </w:rPr>
+        <w:t>COTAÇÃO DOS MATERIAIS, DE ACORDO COM O TERMO DE REFERÊNCIA</w:t>
+      </w:r>
+    </w:p>
+    <w:p>
+      <w:pPr>
+        <w:spacing w:after="80"/>
+        <w:jc w:val="left"/>
+      </w:pPr>
+      <w:r>
+        <w:rPr>
+          <w:b/>
+          <w:i w:val="0"/>
+          <w:color w:val="020E26"/>
+          <w:sz w:val="18"/>
+        </w:rPr>
+        <w:t xml:space="preserve">Objeto: </w:t>
+      </w:r>
+      <w:r>
+        <w:rPr>
+          <w:b w:val="0"/>
+          <w:i w:val="0"/>
+          <w:color w:val="5B677A"/>
+          <w:sz w:val="18"/>
+        </w:rPr>
+        <w:t>{{ edital.objeto }}</w:t>
       </w:r>
     </w:p>
     <w:tbl>
       <w:tblPr>
-        <w:tblStyle w:val="TableGrid"/>
         <w:tblW w:type="auto" w:w="0"/>
+        <w:jc w:val="center"/>
+        <w:tblLayout w:type="fixed"/>
         <w:tblLook w:firstColumn="1" w:firstRow="1" w:lastColumn="0" w:lastRow="0" w:noHBand="0" w:noVBand="1" w:val="04A0"/>
+        <w:tblBorders>
+          <w:top w:val="single" w:sz="4" w:color="D5DEEA"/>
+          <w:bottom w:val="single" w:sz="4" w:color="D5DEEA"/>
+          <w:insideH w:val="single" w:sz="4" w:color="D5DEEA"/>
+          <w:left w:val="nil"/>
+          <w:right w:val="nil"/>
+          <w:insideV w:val="nil"/>
+        </w:tblBorders>
       </w:tblPr>
       <w:tblGrid>
-        <w:gridCol w:w="1246"/>
-        <w:gridCol w:w="1246"/>
-        <w:gridCol w:w="1246"/>
-        <w:gridCol w:w="1246"/>
-        <w:gridCol w:w="1246"/>
-        <w:gridCol w:w="1246"/>
-        <w:gridCol w:w="1246"/>
-        <w:gridCol w:w="1246"/>
+        <w:gridCol w:w="1205"/>
+        <w:gridCol w:w="1205"/>
+        <w:gridCol w:w="1205"/>
+        <w:gridCol w:w="1205"/>
+        <w:gridCol w:w="1205"/>
+        <w:gridCol w:w="1205"/>
+        <w:gridCol w:w="1205"/>
+        <w:gridCol w:w="1205"/>
       </w:tblGrid>
       <w:tr>
+        <w:trPr>
+          <w:tblHeader w:val="true"/>
+        </w:trPr>
         <w:tc>
           <w:tcPr>
-            <w:tcW w:type="dxa" w:w="1246"/>
+            <w:tcW w:type="dxa" w:w="624"/>
+            <w:shd w:val="clear" w:color="auto" w:fill="020E26"/>
+            <w:vAlign w:val="center"/>
           </w:tcPr>
           <w:p>
-            <w:r/>
+            <w:pPr>
+              <w:jc w:val="left"/>
+            </w:pPr>
             <w:r>
               <w:rPr>
                 <w:b/>
+                <w:i w:val="0"/>
+                <w:color w:val="FFFFFF"/>
+                <w:sz w:val="17"/>
               </w:rPr>
               <w:t>Item</w:t>
             </w:r>
@@ -86,13 +226,20 @@
         </w:tc>
         <w:tc>
           <w:tcPr>
-            <w:tcW w:type="dxa" w:w="1246"/>
+            <w:tcW w:type="dxa" w:w="3572"/>
+            <w:shd w:val="clear" w:color="auto" w:fill="020E26"/>
+            <w:vAlign w:val="center"/>
           </w:tcPr>
           <w:p>
-            <w:r/>
+            <w:pPr>
+              <w:jc w:val="left"/>
+            </w:pPr>
             <w:r>
               <w:rPr>
                 <w:b/>
+                <w:i w:val="0"/>
+                <w:color w:val="FFFFFF"/>
+                <w:sz w:val="17"/>
               </w:rPr>
               <w:t>Descrição</w:t>
             </w:r>
@@ -100,13 +247,20 @@
         </w:tc>
         <w:tc>
           <w:tcPr>
-            <w:tcW w:type="dxa" w:w="1246"/>
+            <w:tcW w:type="dxa" w:w="1077"/>
+            <w:shd w:val="clear" w:color="auto" w:fill="020E26"/>
+            <w:vAlign w:val="center"/>
           </w:tcPr>
           <w:p>
-            <w:r/>
+            <w:pPr>
+              <w:jc w:val="left"/>
+            </w:pPr>
             <w:r>
               <w:rPr>
                 <w:b/>
+                <w:i w:val="0"/>
+                <w:color w:val="FFFFFF"/>
+                <w:sz w:val="17"/>
               </w:rPr>
               <w:t>Marca</w:t>
             </w:r>
@@ -114,13 +268,20 @@
         </w:tc>
         <w:tc>
           <w:tcPr>
-            <w:tcW w:type="dxa" w:w="1246"/>
+            <w:tcW w:type="dxa" w:w="1077"/>
+            <w:shd w:val="clear" w:color="auto" w:fill="020E26"/>
+            <w:vAlign w:val="center"/>
           </w:tcPr>
           <w:p>
-            <w:r/>
+            <w:pPr>
+              <w:jc w:val="left"/>
+            </w:pPr>
             <w:r>
               <w:rPr>
                 <w:b/>
+                <w:i w:val="0"/>
+                <w:color w:val="FFFFFF"/>
+                <w:sz w:val="17"/>
               </w:rPr>
               <w:t>Modelo</w:t>
             </w:r>
@@ -128,57 +289,85 @@
         </w:tc>
         <w:tc>
           <w:tcPr>
-            <w:tcW w:type="dxa" w:w="1246"/>
+            <w:tcW w:type="dxa" w:w="680"/>
+            <w:shd w:val="clear" w:color="auto" w:fill="020E26"/>
+            <w:vAlign w:val="center"/>
           </w:tcPr>
           <w:p>
-            <w:r/>
+            <w:pPr>
+              <w:jc w:val="left"/>
+            </w:pPr>
             <w:r>
               <w:rPr>
                 <w:b/>
+                <w:i w:val="0"/>
+                <w:color w:val="FFFFFF"/>
+                <w:sz w:val="17"/>
               </w:rPr>
-              <w:t>Un.</w:t>
+              <w:t>Unid.</w:t>
             </w:r>
           </w:p>
         </w:tc>
         <w:tc>
           <w:tcPr>
-            <w:tcW w:type="dxa" w:w="1246"/>
+            <w:tcW w:type="dxa" w:w="680"/>
+            <w:shd w:val="clear" w:color="auto" w:fill="020E26"/>
+            <w:vAlign w:val="center"/>
           </w:tcPr>
           <w:p>
-            <w:r/>
+            <w:pPr>
+              <w:jc w:val="right"/>
+            </w:pPr>
             <w:r>
               <w:rPr>
                 <w:b/>
+                <w:i w:val="0"/>
+                <w:color w:val="FFFFFF"/>
+                <w:sz w:val="17"/>
               </w:rPr>
-              <w:t>Qtd.</w:t>
+              <w:t>Qtde</w:t>
             </w:r>
           </w:p>
         </w:tc>
         <w:tc>
           <w:tcPr>
-            <w:tcW w:type="dxa" w:w="1246"/>
+            <w:tcW w:type="dxa" w:w="964"/>
+            <w:shd w:val="clear" w:color="auto" w:fill="020E26"/>
+            <w:vAlign w:val="center"/>
           </w:tcPr>
           <w:p>
-            <w:r/>
+            <w:pPr>
+              <w:jc w:val="right"/>
+            </w:pPr>
             <w:r>
               <w:rPr>
                 <w:b/>
+                <w:i w:val="0"/>
+                <w:color w:val="FFFFFF"/>
+                <w:sz w:val="17"/>
               </w:rPr>
-              <w:t>Valor unit.</w:t>
+              <w:t>Preço unit.</w:t>
             </w:r>
           </w:p>
         </w:tc>
         <w:tc>
           <w:tcPr>
-            <w:tcW w:type="dxa" w:w="1246"/>
+            <w:tcW w:type="dxa" w:w="964"/>
+            <w:shd w:val="clear" w:color="auto" w:fill="020E26"/>
+            <w:vAlign w:val="center"/>
           </w:tcPr>
           <w:p>
-            <w:r/>
+            <w:pPr>
+              <w:jc w:val="right"/>
+            </w:pPr>
             <w:r>
               <w:rPr>
                 <w:b/>
+                <w:i w:val="0"/>
+                <w:color w:val="FFFFFF"/>
+                <w:sz w:val="17"/>
               </w:rPr>
-              <w:t>Valor total</w:t>
+              <w:t>Preço total</w:t>
             </w:r>
           </w:p>
         </w:tc>
@@ -186,7 +375,7 @@
       <w:tr>
         <w:tc>
           <w:tcPr>
-            <w:tcW w:type="dxa" w:w="1246"/>
+            <w:tcW w:type="dxa" w:w="624"/>
           </w:tcPr>
           <w:p>
             <w:r>
@@ -196,43 +385,43 @@
         </w:tc>
         <w:tc>
           <w:tcPr>
-            <w:tcW w:type="dxa" w:w="1246"/>
+            <w:tcW w:type="dxa" w:w="3572"/>
           </w:tcPr>
           <w:p/>
         </w:tc>
         <w:tc>
           <w:tcPr>
-            <w:tcW w:type="dxa" w:w="1246"/>
+            <w:tcW w:type="dxa" w:w="1077"/>
           </w:tcPr>
           <w:p/>
         </w:tc>
         <w:tc>
           <w:tcPr>
-            <w:tcW w:type="dxa" w:w="1246"/>
+            <w:tcW w:type="dxa" w:w="1077"/>
           </w:tcPr>
           <w:p/>
         </w:tc>
         <w:tc>
           <w:tcPr>
-            <w:tcW w:type="dxa" w:w="1246"/>
+            <w:tcW w:type="dxa" w:w="680"/>
           </w:tcPr>
           <w:p/>
         </w:tc>
         <w:tc>
           <w:tcPr>
-            <w:tcW w:type="dxa" w:w="1246"/>
+            <w:tcW w:type="dxa" w:w="680"/>
           </w:tcPr>
           <w:p/>
         </w:tc>
         <w:tc>
           <w:tcPr>
-            <w:tcW w:type="dxa" w:w="1246"/>
+            <w:tcW w:type="dxa" w:w="964"/>
           </w:tcPr>
           <w:p/>
         </w:tc>
         <w:tc>
           <w:tcPr>
-            <w:tcW w:type="dxa" w:w="1246"/>
+            <w:tcW w:type="dxa" w:w="964"/>
           </w:tcPr>
           <w:p/>
         </w:tc>
@@ -240,80 +429,160 @@
       <w:tr>
         <w:tc>
           <w:tcPr>
-            <w:tcW w:type="dxa" w:w="1246"/>
+            <w:tcW w:type="dxa" w:w="624"/>
+            <w:vAlign w:val="center"/>
           </w:tcPr>
           <w:p>
+            <w:pPr>
+              <w:jc w:val="left"/>
+            </w:pPr>
             <w:r>
+              <w:rPr>
+                <w:b w:val="0"/>
+                <w:i w:val="0"/>
+                <w:color w:val="1F2937"/>
+                <w:sz w:val="17"/>
+              </w:rPr>
               <w:t>{{ item.numero }}</w:t>
             </w:r>
           </w:p>
         </w:tc>
         <w:tc>
           <w:tcPr>
-            <w:tcW w:type="dxa" w:w="1246"/>
+            <w:tcW w:type="dxa" w:w="3572"/>
+            <w:vAlign w:val="center"/>
           </w:tcPr>
           <w:p>
+            <w:pPr>
+              <w:jc w:val="left"/>
+            </w:pPr>
             <w:r>
+              <w:rPr>
+                <w:b w:val="0"/>
+                <w:i w:val="0"/>
+                <w:color w:val="1F2937"/>
+                <w:sz w:val="17"/>
+              </w:rPr>
               <w:t>{{ item.descricao }}</w:t>
             </w:r>
           </w:p>
         </w:tc>
         <w:tc>
           <w:tcPr>
-            <w:tcW w:type="dxa" w:w="1246"/>
+            <w:tcW w:type="dxa" w:w="1077"/>
+            <w:vAlign w:val="center"/>
           </w:tcPr>
           <w:p>
+            <w:pPr>
+              <w:jc w:val="left"/>
+            </w:pPr>
             <w:r>
+              <w:rPr>
+                <w:b w:val="0"/>
+                <w:i w:val="0"/>
+                <w:color w:val="1F2937"/>
+                <w:sz w:val="17"/>
+              </w:rPr>
               <w:t>{{ item.marca }}</w:t>
             </w:r>
           </w:p>
         </w:tc>
         <w:tc>
           <w:tcPr>
-            <w:tcW w:type="dxa" w:w="1246"/>
+            <w:tcW w:type="dxa" w:w="1077"/>
+            <w:vAlign w:val="center"/>
           </w:tcPr>
           <w:p>
+            <w:pPr>
+              <w:jc w:val="left"/>
+            </w:pPr>
             <w:r>
+              <w:rPr>
+                <w:b w:val="0"/>
+                <w:i w:val="0"/>
+                <w:color w:val="1F2937"/>
+                <w:sz w:val="17"/>
+              </w:rPr>
               <w:t>{{ item.modelo }}</w:t>
             </w:r>
           </w:p>
         </w:tc>
         <w:tc>
           <w:tcPr>
-            <w:tcW w:type="dxa" w:w="1246"/>
+            <w:tcW w:type="dxa" w:w="680"/>
+            <w:vAlign w:val="center"/>
           </w:tcPr>
           <w:p>
+            <w:pPr>
+              <w:jc w:val="left"/>
+            </w:pPr>
             <w:r>
+              <w:rPr>
+                <w:b w:val="0"/>
+                <w:i w:val="0"/>
+                <w:color w:val="1F2937"/>
+                <w:sz w:val="17"/>
+              </w:rPr>
               <w:t>{{ item.unidade }}</w:t>
             </w:r>
           </w:p>
         </w:tc>
         <w:tc>
           <w:tcPr>
-            <w:tcW w:type="dxa" w:w="1246"/>
+            <w:tcW w:type="dxa" w:w="680"/>
+            <w:vAlign w:val="center"/>
           </w:tcPr>
           <w:p>
+            <w:pPr>
+              <w:jc w:val="right"/>
+            </w:pPr>
             <w:r>
+              <w:rPr>
+                <w:b w:val="0"/>
+                <w:i w:val="0"/>
+                <w:color w:val="1F2937"/>
+                <w:sz w:val="17"/>
+              </w:rPr>
               <w:t>{{ item.quantidade }}</w:t>
             </w:r>
           </w:p>
         </w:tc>
         <w:tc>
           <w:tcPr>
-            <w:tcW w:type="dxa" w:w="1246"/>
+            <w:tcW w:type="dxa" w:w="964"/>
+            <w:vAlign w:val="center"/>
           </w:tcPr>
           <w:p>
+            <w:pPr>
+              <w:jc w:val="right"/>
+            </w:pPr>
             <w:r>
+              <w:rPr>
+                <w:b w:val="0"/>
+                <w:i w:val="0"/>
+                <w:color w:val="1F2937"/>
+                <w:sz w:val="17"/>
+              </w:rPr>
               <w:t>{{ item.valor_unitario }}</w:t>
             </w:r>
           </w:p>
         </w:tc>
         <w:tc>
           <w:tcPr>
-            <w:tcW w:type="dxa" w:w="1246"/>
+            <w:tcW w:type="dxa" w:w="964"/>
+            <w:vAlign w:val="center"/>
           </w:tcPr>
           <w:p>
+            <w:pPr>
+              <w:jc w:val="right"/>
+            </w:pPr>
             <w:r>
+              <w:rPr>
+                <w:b/>
+                <w:i w:val="0"/>
+                <w:color w:val="1F2937"/>
+                <w:sz w:val="17"/>
+              </w:rPr>
               <w:t>{{ item.valor_total }}</w:t>
             </w:r>
           </w:p>
@@ -322,7 +591,7 @@
       <w:tr>
         <w:tc>
           <w:tcPr>
-            <w:tcW w:type="dxa" w:w="1246"/>
+            <w:tcW w:type="dxa" w:w="624"/>
           </w:tcPr>
           <w:p>
             <w:r>
@@ -332,113 +601,657 @@
         </w:tc>
         <w:tc>
           <w:tcPr>
-            <w:tcW w:type="dxa" w:w="1246"/>
+            <w:tcW w:type="dxa" w:w="3572"/>
           </w:tcPr>
           <w:p/>
         </w:tc>
         <w:tc>
           <w:tcPr>
-            <w:tcW w:type="dxa" w:w="1246"/>
+            <w:tcW w:type="dxa" w:w="1077"/>
           </w:tcPr>
           <w:p/>
         </w:tc>
         <w:tc>
           <w:tcPr>
-            <w:tcW w:type="dxa" w:w="1246"/>
+            <w:tcW w:type="dxa" w:w="1077"/>
           </w:tcPr>
           <w:p/>
         </w:tc>
         <w:tc>
           <w:tcPr>
-            <w:tcW w:type="dxa" w:w="1246"/>
+            <w:tcW w:type="dxa" w:w="680"/>
           </w:tcPr>
           <w:p/>
         </w:tc>
         <w:tc>
           <w:tcPr>
-            <w:tcW w:type="dxa" w:w="1246"/>
+            <w:tcW w:type="dxa" w:w="680"/>
           </w:tcPr>
           <w:p/>
         </w:tc>
         <w:tc>
           <w:tcPr>
-            <w:tcW w:type="dxa" w:w="1246"/>
+            <w:tcW w:type="dxa" w:w="964"/>
           </w:tcPr>
           <w:p/>
         </w:tc>
         <w:tc>
           <w:tcPr>
-            <w:tcW w:type="dxa" w:w="1246"/>
+            <w:tcW w:type="dxa" w:w="964"/>
           </w:tcPr>
           <w:p/>
+        </w:tc>
+      </w:tr>
+      <w:tr>
+        <w:tc>
+          <w:tcPr>
+            <w:tcW w:type="dxa" w:w="964"/>
+            <w:gridSpan w:val="7"/>
+            <w:shd w:val="clear" w:color="auto" w:fill="E6F0FC"/>
+          </w:tcPr>
+          <w:p>
+            <w:pPr>
+              <w:jc w:val="right"/>
+            </w:pPr>
+            <w:r>
+              <w:rPr>
+                <w:b/>
+                <w:i w:val="0"/>
+                <w:color w:val="020E26"/>
+                <w:sz w:val="18"/>
+              </w:rPr>
+              <w:t>VALOR GLOBAL</w:t>
+            </w:r>
+          </w:p>
+        </w:tc>
+        <w:tc>
+          <w:tcPr>
+            <w:tcW w:type="dxa" w:w="964"/>
+            <w:shd w:val="clear" w:color="auto" w:fill="E6F0FC"/>
+          </w:tcPr>
+          <w:p>
+            <w:pPr>
+              <w:jc w:val="right"/>
+            </w:pPr>
+            <w:r>
+              <w:rPr>
+                <w:b/>
+                <w:i w:val="0"/>
+                <w:color w:val="020E26"/>
+                <w:sz w:val="18"/>
+              </w:rPr>
+              <w:t>{{ valor_total }}</w:t>
+            </w:r>
+          </w:p>
         </w:tc>
       </w:tr>
     </w:tbl>
     <w:p>
       <w:pPr>
+        <w:spacing w:after="120" w:before="160"/>
+        <w:jc w:val="left"/>
+      </w:pPr>
+      <w:r>
+        <w:rPr>
+          <w:b/>
+          <w:i w:val="0"/>
+          <w:color w:val="020E26"/>
+        </w:rPr>
+        <w:t xml:space="preserve">Valor total: </w:t>
+      </w:r>
+      <w:r>
+        <w:rPr>
+          <w:b/>
+          <w:i w:val="0"/>
+          <w:color w:val="1F2937"/>
+        </w:rPr>
+        <w:t>{{ valor_total }} ({{ valor_total_extenso }}).</w:t>
+      </w:r>
+    </w:p>
+    <w:p>
+      <w:pPr>
+        <w:keepNext/>
+        <w:spacing w:before="200" w:after="80"/>
+      </w:pPr>
+      <w:r>
+        <w:rPr>
+          <w:b/>
+          <w:i w:val="0"/>
+          <w:color w:val="1E8BF0"/>
+          <w:sz w:val="21"/>
+        </w:rPr>
+        <w:t xml:space="preserve">3.  </w:t>
+      </w:r>
+      <w:r>
+        <w:rPr>
+          <w:b/>
+          <w:i w:val="0"/>
+          <w:color w:val="020E26"/>
+          <w:sz w:val="21"/>
+        </w:rPr>
+        <w:t>VALIDADE DA PROPOSTA</w:t>
+      </w:r>
+    </w:p>
+    <w:p>
+      <w:pPr>
+        <w:spacing w:after="120"/>
+        <w:jc w:val="both"/>
+      </w:pPr>
+      <w:r>
+        <w:rPr>
+          <w:b w:val="0"/>
+          <w:i w:val="0"/>
+          <w:color w:val="1F2937"/>
+        </w:rPr>
+        <w:t>{{ validade_dias }} ({{ validade_extenso }}) dias, conforme edital e termo de referência, contados da data de sua apresentação.</w:t>
+      </w:r>
+    </w:p>
+    <w:p>
+      <w:pPr>
+        <w:keepNext/>
+        <w:spacing w:before="200" w:after="80"/>
+      </w:pPr>
+      <w:r>
+        <w:rPr>
+          <w:b/>
+          <w:i w:val="0"/>
+          <w:color w:val="1E8BF0"/>
+          <w:sz w:val="21"/>
+        </w:rPr>
+        <w:t xml:space="preserve">4.  </w:t>
+      </w:r>
+      <w:r>
+        <w:rPr>
+          <w:b/>
+          <w:i w:val="0"/>
+          <w:color w:val="020E26"/>
+          <w:sz w:val="21"/>
+        </w:rPr>
+        <w:t>DADOS BANCÁRIOS PARA PAGAMENTO</w:t>
+      </w:r>
+    </w:p>
+    <w:p>
+      <w:pPr>
+        <w:spacing w:after="120"/>
+        <w:jc w:val="left"/>
+      </w:pPr>
+      <w:r>
+        <w:rPr>
+          <w:b/>
+          <w:i w:val="0"/>
+          <w:color w:val="1F2937"/>
+        </w:rPr>
+        <w:t xml:space="preserve">Banco: </w:t>
+      </w:r>
+      <w:r>
+        <w:rPr>
+          <w:b w:val="0"/>
+          <w:i w:val="0"/>
+          <w:color w:val="1F2937"/>
+        </w:rPr>
+        <w:t xml:space="preserve">{{ empresa.banco }}     </w:t>
+      </w:r>
+      <w:r>
+        <w:rPr>
+          <w:b/>
+          <w:i w:val="0"/>
+          <w:color w:val="1F2937"/>
+        </w:rPr>
+        <w:t xml:space="preserve">Agência: </w:t>
+      </w:r>
+      <w:r>
+        <w:rPr>
+          <w:b w:val="0"/>
+          <w:i w:val="0"/>
+          <w:color w:val="1F2937"/>
+        </w:rPr>
+        <w:t xml:space="preserve">{{ empresa.agencia }}     </w:t>
+      </w:r>
+      <w:r>
+        <w:rPr>
+          <w:b/>
+          <w:i w:val="0"/>
+          <w:color w:val="1F2937"/>
+        </w:rPr>
+        <w:t xml:space="preserve">Conta-corrente: </w:t>
+      </w:r>
+      <w:r>
+        <w:rPr>
+          <w:b w:val="0"/>
+          <w:i w:val="0"/>
+          <w:color w:val="1F2937"/>
+        </w:rPr>
+        <w:t>{{ empresa.conta }}</w:t>
+      </w:r>
+    </w:p>
+    <w:p>
+      <w:pPr>
+        <w:keepNext/>
+        <w:spacing w:before="200" w:after="80"/>
+      </w:pPr>
+      <w:r>
+        <w:rPr>
+          <w:b/>
+          <w:i w:val="0"/>
+          <w:color w:val="1E8BF0"/>
+          <w:sz w:val="21"/>
+        </w:rPr>
+        <w:t xml:space="preserve">5.  </w:t>
+      </w:r>
+      <w:r>
+        <w:rPr>
+          <w:b/>
+          <w:i w:val="0"/>
+          <w:color w:val="020E26"/>
+          <w:sz w:val="21"/>
+        </w:rPr>
+        <w:t>DECLARAÇÕES</w:t>
+      </w:r>
+    </w:p>
+    <w:p>
+      <w:pPr>
+        <w:spacing w:after="80"/>
+        <w:ind w:left="227"/>
+        <w:jc w:val="both"/>
+      </w:pPr>
+      <w:r>
+        <w:rPr>
+          <w:b w:val="0"/>
+          <w:i w:val="0"/>
+          <w:color w:val="1F2937"/>
+        </w:rPr>
+        <w:t>Declaramos que estamos de pleno acordo com todas as condições estabelecidas no Edital e seus Anexos, bem como aceitamos todas as obrigações e responsabilidades constantes das especificações.</w:t>
+      </w:r>
+    </w:p>
+    <w:p>
+      <w:pPr>
+        <w:spacing w:after="80"/>
+        <w:ind w:left="227"/>
+        <w:jc w:val="both"/>
+      </w:pPr>
+      <w:r>
+        <w:rPr>
+          <w:b w:val="0"/>
+          <w:i w:val="0"/>
+          <w:color w:val="1F2937"/>
+        </w:rPr>
+        <w:t>Declaramos que nos preços cotados estão incluídas todas as despesas que, direta ou indiretamente, fazem parte do presente objeto, tais como gastos da empresa com suporte técnico e administrativo, impostos, seguros, taxas, ou quaisquer outros que possam incidir sobre gastos da empresa, sem quaisquer acréscimos em virtude de expectativa inflacionária e deduzidos os descontos eventualmente concedidos.</w:t>
+      </w:r>
+    </w:p>
+    <w:p>
+      <w:pPr>
+        <w:spacing w:after="80"/>
+        <w:ind w:left="227"/>
+        <w:jc w:val="both"/>
+      </w:pPr>
+      <w:r>
+        <w:rPr>
+          <w:b w:val="0"/>
+          <w:i w:val="0"/>
+          <w:color w:val="1F2937"/>
+        </w:rPr>
+        <w:t>Declaramos ainda que a documentação de habilitação consiste nos documentos elencados no SICAF, conforme a Lei de Licitações nº 14.133/2021 e o competente Termo de Referência.</w:t>
+      </w:r>
+    </w:p>
+    <w:p>
+      <w:pPr>
+        <w:spacing w:after="80"/>
+        <w:ind w:left="227"/>
+        <w:jc w:val="both"/>
+      </w:pPr>
+      <w:r>
+        <w:rPr>
+          <w:b w:val="0"/>
+          <w:i w:val="0"/>
+          <w:color w:val="1F2937"/>
+        </w:rPr>
+        <w:t>Declaramos estar de acordo e que atendemos ao artigo 7º, inciso XXXIII, da Constituição Federal.</w:t>
+      </w:r>
+    </w:p>
+    <w:p>
+      <w:pPr>
+        <w:keepNext/>
+        <w:spacing w:before="200" w:after="80"/>
+      </w:pPr>
+      <w:r>
+        <w:rPr>
+          <w:b/>
+          <w:i w:val="0"/>
+          <w:color w:val="1E8BF0"/>
+          <w:sz w:val="21"/>
+        </w:rPr>
+        <w:t xml:space="preserve">6.  </w:t>
+      </w:r>
+      <w:r>
+        <w:rPr>
+          <w:b/>
+          <w:i w:val="0"/>
+          <w:color w:val="020E26"/>
+          <w:sz w:val="21"/>
+        </w:rPr>
+        <w:t>DADOS DA EMPRESA</w:t>
+      </w:r>
+    </w:p>
+    <w:tbl>
+      <w:tblPr>
+        <w:tblW w:type="auto" w:w="0"/>
+        <w:tblLayout w:type="fixed"/>
+        <w:tblLook w:firstColumn="1" w:firstRow="1" w:lastColumn="0" w:lastRow="0" w:noHBand="0" w:noVBand="1" w:val="04A0"/>
+      </w:tblPr>
+      <w:tblGrid>
+        <w:gridCol w:w="4819"/>
+        <w:gridCol w:w="4819"/>
+      </w:tblGrid>
+      <w:tr>
+        <w:tc>
+          <w:tcPr>
+            <w:tcW w:type="dxa" w:w="4819"/>
+            <w:shd w:val="clear" w:color="auto" w:fill="F2F6FB"/>
+          </w:tcPr>
+          <w:p>
+            <w:r>
+              <w:rPr>
+                <w:b/>
+                <w:i w:val="0"/>
+                <w:color w:val="020E26"/>
+                <w:sz w:val="18"/>
+              </w:rPr>
+              <w:t>{{ empresa.nome }}</w:t>
+            </w:r>
+          </w:p>
+          <w:p>
+            <w:r>
+              <w:rPr>
+                <w:b w:val="0"/>
+                <w:i w:val="0"/>
+                <w:color w:val="1F2937"/>
+                <w:sz w:val="18"/>
+              </w:rPr>
+              <w:t>CNPJ {{ empresa.cnpj }}</w:t>
+            </w:r>
+          </w:p>
+          <w:p>
+            <w:r>
+              <w:rPr>
+                <w:b w:val="0"/>
+                <w:i w:val="0"/>
+                <w:color w:val="1F2937"/>
+                <w:sz w:val="18"/>
+              </w:rPr>
+              <w:t>{{ empresa.endereco }}</w:t>
+            </w:r>
+          </w:p>
+          <w:p>
+            <w:r>
+              <w:rPr>
+                <w:b w:val="0"/>
+                <w:i w:val="0"/>
+                <w:color w:val="1F2937"/>
+                <w:sz w:val="18"/>
+              </w:rPr>
+              <w:t>{% if empresa.cep %}CEP {{ empresa.cep }}{% endif %}</w:t>
+            </w:r>
+          </w:p>
+        </w:tc>
+        <w:tc>
+          <w:tcPr>
+            <w:tcW w:type="dxa" w:w="4819"/>
+            <w:shd w:val="clear" w:color="auto" w:fill="F2F6FB"/>
+          </w:tcPr>
+          <w:p>
+            <w:r>
+              <w:rPr>
+                <w:b w:val="0"/>
+                <w:i w:val="0"/>
+                <w:color w:val="1F2937"/>
+                <w:sz w:val="18"/>
+              </w:rPr>
+              <w:t>E-mail: {{ empresa.email }}</w:t>
+            </w:r>
+          </w:p>
+          <w:p>
+            <w:r>
+              <w:rPr>
+                <w:b w:val="0"/>
+                <w:i w:val="0"/>
+                <w:color w:val="1F2937"/>
+                <w:sz w:val="18"/>
+              </w:rPr>
+              <w:t>Telefone: {{ empresa.telefone }}</w:t>
+            </w:r>
+          </w:p>
+        </w:tc>
+      </w:tr>
+    </w:tbl>
+    <w:p>
+      <w:pPr>
+        <w:keepNext/>
+        <w:spacing w:before="200" w:after="80"/>
+      </w:pPr>
+      <w:r>
+        <w:rPr>
+          <w:b/>
+          <w:i w:val="0"/>
+          <w:color w:val="1E8BF0"/>
+          <w:sz w:val="21"/>
+        </w:rPr>
+        <w:t xml:space="preserve">7.  </w:t>
+      </w:r>
+      <w:r>
+        <w:rPr>
+          <w:b/>
+          <w:i w:val="0"/>
+          <w:color w:val="020E26"/>
+          <w:sz w:val="21"/>
+        </w:rPr>
+        <w:t>REPRESENTANTE LEGAL</w:t>
+      </w:r>
+    </w:p>
+    <w:p>
+      <w:pPr>
+        <w:spacing w:after="120"/>
+        <w:jc w:val="both"/>
+      </w:pPr>
+      <w:r>
+        <w:rPr>
+          <w:b w:val="0"/>
+          <w:i w:val="0"/>
+          <w:color w:val="1F2937"/>
+        </w:rPr>
+        <w:t>{{ empresa.responsavel_legal|upper }}{% if empresa.responsavel_qualificacao %}, {{ empresa.responsavel_qualificacao }}{% endif %}{% if empresa.responsavel_cpf %}, portador do CPF nº {{ empresa.responsavel_cpf }}{% endif %}{% if empresa.responsavel_rg %} e do RG nº {{ empresa.responsavel_rg }}{% endif %}.</w:t>
+      </w:r>
+    </w:p>
+    <w:p>
+      <w:pPr>
+        <w:spacing w:after="720" w:before="280"/>
         <w:jc w:val="right"/>
       </w:pPr>
       <w:r>
         <w:rPr>
-          <w:b/>
+          <w:b w:val="0"/>
+          <w:i w:val="0"/>
+          <w:color w:val="1F2937"/>
         </w:rPr>
-        <w:t>Valor global da proposta: {{ valor_total }}</w:t>
-      </w:r>
-    </w:p>
-    <w:p>
-      <w:r>
-        <w:t>Validade da proposta: {{ validade_dias }} dias, contados da data da sessão pública.</w:t>
-      </w:r>
-    </w:p>
-    <w:p>
-      <w:r>
-        <w:t>Nos preços estão incluídos todos os custos e despesas, como tributos, encargos, frete e seguro, até a entrega no local indicado no edital.</w:t>
-      </w:r>
-    </w:p>
-    <w:p>
-      <w:r>
-        <w:t>Declaramos que o objeto ofertado atende a todas as especificações do edital.</w:t>
-      </w:r>
-    </w:p>
-    <w:p/>
-    <w:p>
-      <w:r>
         <w:t>{{ cidade_data }}</w:t>
-      </w:r>
-    </w:p>
-    <w:p/>
-    <w:p>
-      <w:pPr>
-        <w:jc w:val="center"/>
-      </w:pPr>
-      <w:r>
-        <w:t>________________________________________</w:t>
       </w:r>
     </w:p>
     <w:p>
       <w:pPr>
+        <w:keepNext/>
+        <w:spacing w:after="0"/>
         <w:jc w:val="center"/>
       </w:pPr>
       <w:r>
-        <w:t>{{ empresa.responsavel_legal }}</w:t>
+        <w:rPr>
+          <w:b w:val="0"/>
+          <w:i w:val="0"/>
+          <w:color w:val="5B677A"/>
+        </w:rPr>
+        <w:t>______________________________________________</w:t>
       </w:r>
     </w:p>
     <w:p>
       <w:pPr>
+        <w:keepNext/>
+        <w:spacing w:after="0"/>
         <w:jc w:val="center"/>
       </w:pPr>
       <w:r>
-        <w:t>Representante legal — {{ empresa.nome }}</w:t>
+        <w:rPr>
+          <w:b/>
+          <w:i w:val="0"/>
+          <w:color w:val="020E26"/>
+        </w:rPr>
+        <w:t>{{ empresa.responsavel_legal|upper }}</w:t>
+      </w:r>
+    </w:p>
+    <w:p>
+      <w:pPr>
+        <w:keepNext/>
+        <w:spacing w:after="0"/>
+        <w:jc w:val="center"/>
+      </w:pPr>
+      <w:r>
+        <w:rPr>
+          <w:b w:val="0"/>
+          <w:i w:val="0"/>
+          <w:color w:val="5B677A"/>
+          <w:sz w:val="18"/>
+        </w:rPr>
+        <w:t>{% if empresa.responsavel_cpf %}CPF {{ empresa.responsavel_cpf }} · {% endif %}Representante legal</w:t>
+      </w:r>
+    </w:p>
+    <w:p>
+      <w:pPr>
+        <w:keepNext/>
+        <w:spacing w:after="0"/>
+        <w:jc w:val="center"/>
+      </w:pPr>
+      <w:r>
+        <w:rPr>
+          <w:b w:val="0"/>
+          <w:i w:val="0"/>
+          <w:color w:val="5B677A"/>
+          <w:sz w:val="18"/>
+        </w:rPr>
+        <w:t>{{ empresa.nome }}</w:t>
       </w:r>
     </w:p>
     <w:sectPr>
-      <w:pgSz w:w="12240" w:h="15840"/>
-      <w:pgMar w:top="1440" w:right="1134" w:bottom="1440" w:left="1134" w:header="720" w:footer="720" w:gutter="0"/>
+      <w:headerReference w:type="default" r:id="rId9"/>
+      <w:footerReference w:type="default" r:id="rId10"/>
+      <w:pgSz w:w="11906" w:h="16838"/>
+      <w:pgMar w:top="2381" w:right="1134" w:bottom="1474" w:left="1134" w:header="0" w:footer="454" w:gutter="0"/>
       <w:cols w:space="720"/>
       <w:docGrid w:linePitch="360"/>
     </w:sectPr>
   </w:body>
 </w:document>
+</file>
+
+<file path=word/footer1.xml><?xml version="1.0" encoding="utf-8"?>
+<w:ftr xmlns:m="http://schemas.openxmlformats.org/officeDocument/2006/math" xmlns:mc="http://schemas.openxmlformats.org/markup-compatibility/2006" xmlns:mo="http://schemas.microsoft.com/office/mac/office/2008/main" xmlns:mv="urn:schemas-microsoft-com:mac:vml" xmlns:o="urn:schemas-microsoft-com:office:office" xmlns:r="http://schemas.openxmlformats.org/officeDocument/2006/relationships" xmlns:v="urn:schemas-microsoft-com:vml" xmlns:w10="urn:schemas-microsoft-com:office:word" xmlns:w14="http://schemas.microsoft.com/office/word/2010/wordml" xmlns:w="http://schemas.openxmlformats.org/wordprocessingml/2006/main" xmlns:wne="http://schemas.microsoft.com/office/word/2006/wordml" xmlns:wp14="http://schemas.microsoft.com/office/word/2010/wordprocessingDrawing" xmlns:wp="http://schemas.openxmlformats.org/drawingml/2006/wordprocessingDrawing" xmlns:wpc="http://schemas.microsoft.com/office/word/2010/wordprocessingCanvas" xmlns:wpg="http://schemas.microsoft.com/office/word/2010/wordprocessingGroup" xmlns:wpi="http://schemas.microsoft.com/office/word/2010/wordprocessingInk" xmlns:wps="http://schemas.microsoft.com/office/word/2010/wordprocessingShape" mc:Ignorable="w14 wp14">
+  <w:p>
+    <w:pPr>
+      <w:pStyle w:val="Footer"/>
+      <w:jc w:val="center"/>
+      <w:pBdr>
+        <w:top w:val="single" w:sz="4" w:space="6" w:color="D5DEEA"/>
+      </w:pBdr>
+    </w:pPr>
+    <w:r>
+      <w:rPr>
+        <w:b/>
+        <w:i w:val="0"/>
+        <w:color w:val="020E26"/>
+        <w:sz w:val="16"/>
+      </w:rPr>
+      <w:t>{{ empresa.nome }}</w:t>
+    </w:r>
+    <w:r>
+      <w:rPr>
+        <w:b w:val="0"/>
+        <w:i w:val="0"/>
+        <w:color w:val="5B677A"/>
+        <w:sz w:val="16"/>
+      </w:rPr>
+      <w:t xml:space="preserve">  ·  CNPJ {{ empresa.cnpj }}</w:t>
+    </w:r>
+  </w:p>
+  <w:p>
+    <w:pPr>
+      <w:jc w:val="center"/>
+    </w:pPr>
+    <w:r>
+      <w:rPr>
+        <w:b w:val="0"/>
+        <w:i w:val="0"/>
+        <w:color w:val="5B677A"/>
+        <w:sz w:val="16"/>
+      </w:rPr>
+      <w:t>{{ empresa.endereco }}{% if empresa.cep %} · CEP {{ empresa.cep }}{% endif %}</w:t>
+    </w:r>
+  </w:p>
+  <w:p>
+    <w:pPr>
+      <w:jc w:val="center"/>
+    </w:pPr>
+    <w:r>
+      <w:rPr>
+        <w:b w:val="0"/>
+        <w:i w:val="0"/>
+        <w:color w:val="1E8BF0"/>
+        <w:sz w:val="16"/>
+      </w:rPr>
+      <w:t>{{ empresa.telefone }}  ·  {{ empresa.email }}</w:t>
+    </w:r>
+  </w:p>
+</w:ftr>
+</file>
+
+<file path=word/header1.xml><?xml version="1.0" encoding="utf-8"?>
+<w:hdr xmlns:m="http://schemas.openxmlformats.org/officeDocument/2006/math" xmlns:mc="http://schemas.openxmlformats.org/markup-compatibility/2006" xmlns:mo="http://schemas.microsoft.com/office/mac/office/2008/main" xmlns:mv="urn:schemas-microsoft-com:mac:vml" xmlns:o="urn:schemas-microsoft-com:office:office" xmlns:r="http://schemas.openxmlformats.org/officeDocument/2006/relationships" xmlns:v="urn:schemas-microsoft-com:vml" xmlns:w10="urn:schemas-microsoft-com:office:word" xmlns:w14="http://schemas.microsoft.com/office/word/2010/wordml" xmlns:w="http://schemas.openxmlformats.org/wordprocessingml/2006/main" xmlns:wne="http://schemas.microsoft.com/office/word/2006/wordml" xmlns:wp14="http://schemas.microsoft.com/office/word/2010/wordprocessingDrawing" xmlns:wp="http://schemas.openxmlformats.org/drawingml/2006/wordprocessingDrawing" xmlns:wpc="http://schemas.microsoft.com/office/word/2010/wordprocessingCanvas" xmlns:wpg="http://schemas.microsoft.com/office/word/2010/wordprocessingGroup" xmlns:wpi="http://schemas.microsoft.com/office/word/2010/wordprocessingInk" xmlns:wps="http://schemas.microsoft.com/office/word/2010/wordprocessingShape" mc:Ignorable="w14 wp14">
+  <w:p>
+    <w:pPr>
+      <w:pStyle w:val="Header"/>
+      <w:ind w:left="-1134" w:right="-1134"/>
+    </w:pPr>
+    <w:r>
+      <w:drawing>
+        <wp:inline xmlns:a="http://schemas.openxmlformats.org/drawingml/2006/main" xmlns:pic="http://schemas.openxmlformats.org/drawingml/2006/picture">
+          <wp:extent cx="7560000" cy="1036452"/>
+          <wp:docPr id="1" name="Picture 1"/>
+          <wp:cNvGraphicFramePr>
+            <a:graphicFrameLocks noChangeAspect="1"/>
+          </wp:cNvGraphicFramePr>
+          <a:graphic>
+            <a:graphicData uri="http://schemas.openxmlformats.org/drawingml/2006/picture">
+              <pic:pic>
+                <pic:nvPicPr>
+                  <pic:cNvPr id="0" name="_faixa.png"/>
+                  <pic:cNvPicPr/>
+                </pic:nvPicPr>
+                <pic:blipFill>
+                  <a:blip r:embed="rId1"/>
+                  <a:stretch>
+                    <a:fillRect/>
+                  </a:stretch>
+                </pic:blipFill>
+                <pic:spPr>
+                  <a:xfrm>
+                    <a:off x="0" y="0"/>
+                    <a:ext cx="7560000" cy="1036452"/>
+                  </a:xfrm>
+                  <a:prstGeom prst="rect"/>
+                </pic:spPr>
+              </pic:pic>
+            </a:graphicData>
+          </a:graphic>
+        </wp:inline>
+      </w:drawing>
+    </w:r>
+  </w:p>
+</w:hdr>
 </file>
 
 <file path=word/numbering.xml><?xml version="1.0" encoding="utf-8"?>
@@ -805,8 +1618,9 @@
     <w:qFormat/>
     <w:rsid w:val="00FC693F"/>
     <w:rPr>
-      <w:rFonts w:ascii="Calibri" w:hAnsi="Calibri"/>
-      <w:sz w:val="21"/>
+      <w:rFonts w:ascii="Calibri" w:hAnsi="Calibri" w:eastAsia="Calibri"/>
+      <w:color w:val="1F2937"/>
+      <w:sz w:val="20"/>
     </w:rPr>
   </w:style>
   <w:style w:type="paragraph" w:styleId="Header">

</xml_diff>